<commit_message>
refactor(fase2): unifica série histórica pós-pandemia 2022-2025 em todos os documentos e notebook
- Remove menções restritas a 2025 no escopo global de análise, alinhando toda a narrativa à série pós-pandemia (6.217 acidentes e 15.764 pessoas)
- Mantém o ano de 2025 claramente posicionado como partição de teste prospectivo e benchmark de validação externa contra o Anuário PRF 2025
- Atualiza tabelas de embalagem, delimitação temporal (48 meses contínuos), resumo univariado numérico (n=6.217) e completude
- Harmoniza notebook entendimento_dados_br230.ipynb, main.tex, markdown, docx, doc, pdf e pacote Overleaf ZIP
</commit_message>
<xml_diff>
--- a/entendimento_dados/CRISP-DM-Fase2-Entendimento-Dados-Template.docx
+++ b/entendimento_dados/CRISP-DM-Fase2-Entendimento-Dados-Template.docx
@@ -13385,13 +13385,13 @@
       </w:r>
     </w:p>
     <w:bookmarkEnd w:id="63"/>
-    <w:bookmarkStart w:id="64" w:name="Xee45c8bbdcfa2a84ffbda3fbef240a220e61c3a"/>
+    <w:bookmarkStart w:id="64" w:name="X3241f97f8ab89a7a7c06c18e6d8eba88cd9091e"/>
     <w:p>
       <w:pPr>
         <w:pStyle w:val="Heading3"/>
       </w:pPr>
       <w:r>
-        <w:t xml:space="preserve">Perfil dos Envolvidos e Veículos (Grão Pessoa — 4.410 registros na BR-230)</w:t>
+        <w:t xml:space="preserve">Perfil dos Envolvidos e Veículos (Grão Pessoa — 15.764 registros na BR-230 (2022 a 2025))</w:t>
       </w:r>
     </w:p>
     <w:p>

</xml_diff>

<commit_message>
docs e notebook: adiciona link de acesso e badge interativo do Google Colab
- Inclui caixa de destaque com a URL oficial do Google Colab na capa e na Seção 1.1 de main.tex e main.txt.
- Adiciona badge oficial 'Open in Colab' clicável e link de execução interativa no notebook e no Markdown.
- Recompila os formatos DOCX, DOC, PDF e atualiza o pacote ZIP para o Overleaf.
</commit_message>
<xml_diff>
--- a/entendimento_dados/CRISP-DM-Fase2-Entendimento-Dados-Template.docx
+++ b/entendimento_dados/CRISP-DM-Fase2-Entendimento-Dados-Template.docx
@@ -2,7 +2,7 @@
 <file path=word/document.xml><?xml version="1.0" encoding="utf-8"?>
 <w:document xmlns:w="http://schemas.openxmlformats.org/wordprocessingml/2006/main" xmlns:m="http://schemas.openxmlformats.org/officeDocument/2006/math" xmlns:r="http://schemas.openxmlformats.org/officeDocument/2006/relationships" xmlns:o="urn:schemas-microsoft-com:office:office" xmlns:v="urn:schemas-microsoft-com:vml" xmlns:w10="urn:schemas-microsoft-com:office:word" xmlns:a="http://schemas.openxmlformats.org/drawingml/2006/main" xmlns:pic="http://schemas.openxmlformats.org/drawingml/2006/picture" xmlns:wp="http://schemas.openxmlformats.org/drawingml/2006/wordprocessingDrawing">
   <w:body>
-    <w:bookmarkStart w:id="12" w:name="projeto-da-disciplina-ciência-de-dados"/>
+    <w:bookmarkStart w:id="11" w:name="projeto-da-disciplina-ciência-de-dados"/>
     <w:p>
       <w:pPr>
         <w:pStyle w:val="Heading1"/>
@@ -11,7 +11,7 @@
         <w:t xml:space="preserve">Projeto da Disciplina Ciência de Dados</w:t>
       </w:r>
     </w:p>
-    <w:bookmarkStart w:id="11" w:name="fase-2-entendimento-dos-dados-crisp-dm"/>
+    <w:bookmarkStart w:id="10" w:name="fase-2-entendimento-dos-dados-crisp-dm"/>
     <w:p>
       <w:pPr>
         <w:pStyle w:val="Heading2"/>
@@ -190,10 +190,112 @@
       </w:r>
     </w:p>
     <w:bookmarkEnd w:id="9"/>
-    <w:bookmarkStart w:id="10" w:name="histórico-de-revisões-do-documento"/>
-    <w:p>
-      <w:pPr>
-        <w:pStyle w:val="Heading3"/>
+    <w:bookmarkEnd w:id="10"/>
+    <w:bookmarkEnd w:id="11"/>
+    <w:bookmarkStart w:id="17" w:name="section"/>
+    <w:p>
+      <w:pPr>
+        <w:pStyle w:val="Heading1"/>
+      </w:pPr>
+    </w:p>
+    <w:p>
+      <w:pPr>
+        <w:pStyle w:val="FirstParagraph"/>
+      </w:pPr>
+      <w:hyperlink r:id="rId15">
+        <w:r>
+          <w:drawing>
+            <wp:inline>
+              <wp:extent cx="1114425" cy="190500"/>
+              <wp:effectExtent b="0" l="0" r="0" t="0"/>
+              <wp:docPr descr="Open In Colab" title="" id="13" name="Picture"/>
+              <a:graphic>
+                <a:graphicData uri="http://schemas.openxmlformats.org/drawingml/2006/picture">
+                  <pic:pic>
+                    <pic:nvPicPr>
+                      <pic:cNvPr descr="https://colab.research.google.com/assets/colab-badge.svg" id="14" name="Picture"/>
+                      <pic:cNvPicPr>
+                        <a:picLocks noChangeArrowheads="1" noChangeAspect="1"/>
+                      </pic:cNvPicPr>
+                    </pic:nvPicPr>
+                    <pic:blipFill>
+                      <a:blip>
+                        <a:extLst>
+                          <a:ext uri="{28A0092B-C50C-407E-A947-70E740481C1C}">
+                            <a14:useLocalDpi xmlns:a14="http://schemas.microsoft.com/office/drawing/2010/main" val="0"/>
+                          </a:ext>
+                          <a:ext uri="{96DAC541-7B7A-43D3-8B79-37D633B846F1}">
+                            <asvg:svgBlip xmlns:asvg="http://schemas.microsoft.com/office/drawing/2016/SVG/main" r:embed="rId12"/>
+                          </a:ext>
+                        </a:extLst>
+                      </a:blip>
+                      <a:stretch>
+                        <a:fillRect/>
+                      </a:stretch>
+                    </pic:blipFill>
+                    <pic:spPr bwMode="auto">
+                      <a:xfrm>
+                        <a:off x="0" y="0"/>
+                        <a:ext cx="1114425" cy="190500"/>
+                      </a:xfrm>
+                      <a:prstGeom prst="rect">
+                        <a:avLst/>
+                      </a:prstGeom>
+                      <a:noFill/>
+                      <a:ln w="9525">
+                        <a:noFill/>
+                        <a:headEnd/>
+                        <a:tailEnd/>
+                      </a:ln>
+                    </pic:spPr>
+                  </pic:pic>
+                </a:graphicData>
+              </a:graphic>
+            </wp:inline>
+          </w:drawing>
+        </w:r>
+      </w:hyperlink>
+    </w:p>
+    <w:p>
+      <w:pPr>
+        <w:pStyle w:val="BlockText"/>
+      </w:pPr>
+      <w:r>
+        <w:rPr>
+          <w:b/>
+          <w:bCs/>
+        </w:rPr>
+        <w:t xml:space="preserve">Execução Interativa na Nuvem (Google Colab):</w:t>
+      </w:r>
+      <w:r>
+        <w:br/>
+      </w:r>
+      <w:r>
+        <w:t xml:space="preserve">Todo o pipeline da Fase 2 está disponível para auditoria e execução direta sem necessidade de instalação local:</w:t>
+      </w:r>
+      <w:r>
+        <w:br/>
+      </w:r>
+      <w:hyperlink r:id="rId15">
+        <w:r>
+          <w:rPr>
+            <w:rStyle w:val="Hyperlink"/>
+          </w:rPr>
+          <w:t xml:space="preserve">https://colab.research.google.com/github/batista-neto/Prediction_of_Traffic_Accident_Risk_on_the_BR-230/blob/main/entendimento_dados/entendimento_dados_br230.ipynb</w:t>
+        </w:r>
+      </w:hyperlink>
+    </w:p>
+    <w:p>
+      <w:r>
+        <w:pict>
+          <v:rect style="width:0;height:1.5pt" o:hralign="center" o:hrstd="t" o:hr="t"/>
+        </w:pict>
+      </w:r>
+    </w:p>
+    <w:bookmarkStart w:id="16" w:name="histórico-de-revisões-do-documento"/>
+    <w:p>
+      <w:pPr>
+        <w:pStyle w:val="Heading2"/>
       </w:pPr>
       <w:r>
         <w:t xml:space="preserve">Histórico de Revisões do Documento</w:t>
@@ -352,10 +454,9 @@
         </w:pict>
       </w:r>
     </w:p>
-    <w:bookmarkEnd w:id="10"/>
-    <w:bookmarkEnd w:id="11"/>
-    <w:bookmarkEnd w:id="12"/>
-    <w:bookmarkStart w:id="23" w:name="coleta-dos-dados"/>
+    <w:bookmarkEnd w:id="16"/>
+    <w:bookmarkEnd w:id="17"/>
+    <w:bookmarkStart w:id="28" w:name="coleta-dos-dados"/>
     <w:p>
       <w:pPr>
         <w:pStyle w:val="Heading1"/>
@@ -435,7 +536,7 @@
         <w:t xml:space="preserve">.</w:t>
       </w:r>
     </w:p>
-    <w:bookmarkStart w:id="13" w:name="Xbf39ae001a18985f97b7093b7d832c8c0cc2892"/>
+    <w:bookmarkStart w:id="18" w:name="Xbf39ae001a18985f97b7093b7d832c8c0cc2892"/>
     <w:p>
       <w:pPr>
         <w:pStyle w:val="Heading3"/>
@@ -1054,8 +1155,8 @@
         <w:t xml:space="preserve">, conferindo significância estatística robusta aos estados de menor densidade (o Ceará atinge 82 acidentes, o Tocantins 74 e o Amazonas 92) e viabilizando a validação temporal prospectiva para Machine Learning (treinamento com 2022–2024 e teste com 2025).</w:t>
       </w:r>
     </w:p>
-    <w:bookmarkEnd w:id="13"/>
-    <w:bookmarkStart w:id="17" w:name="X8f5b0ac6779bc8b347f865fb4b1c18b9694ec77"/>
+    <w:bookmarkEnd w:id="18"/>
+    <w:bookmarkStart w:id="22" w:name="X8f5b0ac6779bc8b347f865fb4b1c18b9694ec77"/>
     <w:p>
       <w:pPr>
         <w:pStyle w:val="Heading3"/>
@@ -1313,7 +1414,7 @@
             <w:r>
               <w:t xml:space="preserve"> </w:t>
             </w:r>
-            <w:hyperlink r:id="rId14">
+            <w:hyperlink r:id="rId19">
               <w:r>
                 <w:rPr>
                   <w:rStyle w:val="Hyperlink"/>
@@ -1459,7 +1560,7 @@
             <w:r>
               <w:t xml:space="preserve"> </w:t>
             </w:r>
-            <w:hyperlink r:id="rId14">
+            <w:hyperlink r:id="rId19">
               <w:r>
                 <w:rPr>
                   <w:rStyle w:val="Hyperlink"/>
@@ -1712,7 +1813,7 @@
             <w:r>
               <w:t xml:space="preserve"> </w:t>
             </w:r>
-            <w:hyperlink r:id="rId15">
+            <w:hyperlink r:id="rId20">
               <w:r>
                 <w:rPr>
                   <w:rStyle w:val="Hyperlink"/>
@@ -1823,7 +1924,7 @@
               <w:pStyle w:val="Compact"/>
               <w:jc w:val="left"/>
             </w:pPr>
-            <w:hyperlink r:id="rId16">
+            <w:hyperlink r:id="rId21">
               <w:r>
                 <w:rPr>
                   <w:rStyle w:val="Hyperlink"/>
@@ -1854,8 +1955,8 @@
         </w:pict>
       </w:r>
     </w:p>
-    <w:bookmarkEnd w:id="17"/>
-    <w:bookmarkStart w:id="18" w:name="Xbba2af271938bd2a904f98de656446f80fe4d7c"/>
+    <w:bookmarkEnd w:id="22"/>
+    <w:bookmarkStart w:id="23" w:name="Xbba2af271938bd2a904f98de656446f80fe4d7c"/>
     <w:p>
       <w:pPr>
         <w:pStyle w:val="Heading2"/>
@@ -1951,7 +2052,7 @@
       <w:r>
         <w:t xml:space="preserve">Portal Brasileiro de Dados Abertos e sítio oficial da PRF (</w:t>
       </w:r>
-      <w:hyperlink r:id="rId14">
+      <w:hyperlink r:id="rId19">
         <w:r>
           <w:rPr>
             <w:rStyle w:val="Hyperlink"/>
@@ -2115,8 +2216,8 @@
         <w:t xml:space="preserve">, contagem de mortos e feridos).</w:t>
       </w:r>
     </w:p>
-    <w:bookmarkEnd w:id="18"/>
-    <w:bookmarkStart w:id="19" w:name="X2fda86c3e3622dad74998fd4f51c143ba01b37d"/>
+    <w:bookmarkEnd w:id="23"/>
+    <w:bookmarkStart w:id="24" w:name="X2fda86c3e3622dad74998fd4f51c143ba01b37d"/>
     <w:p>
       <w:pPr>
         <w:pStyle w:val="Heading2"/>
@@ -2340,8 +2441,8 @@
         <w:t xml:space="preserve">).</w:t>
       </w:r>
     </w:p>
-    <w:bookmarkEnd w:id="19"/>
-    <w:bookmarkStart w:id="20" w:name="X8697ab68c7aec6ae30bce9ca2f0c8433523ca9d"/>
+    <w:bookmarkEnd w:id="24"/>
+    <w:bookmarkStart w:id="25" w:name="X8697ab68c7aec6ae30bce9ca2f0c8433523ca9d"/>
     <w:p>
       <w:pPr>
         <w:pStyle w:val="Heading2"/>
@@ -2529,8 +2630,8 @@
         <w:t xml:space="preserve">, o conjunto colapsa perfeitamente para as 4.410 linhas do arquivo por pessoa, atestando a integridade do modelo relacional da PRF.</w:t>
       </w:r>
     </w:p>
-    <w:bookmarkEnd w:id="20"/>
-    <w:bookmarkStart w:id="21" w:name="X9acae2722141df27e065af83cf6081bd3aab973"/>
+    <w:bookmarkEnd w:id="25"/>
+    <w:bookmarkStart w:id="26" w:name="X9acae2722141df27e065af83cf6081bd3aab973"/>
     <w:p>
       <w:pPr>
         <w:pStyle w:val="Heading2"/>
@@ -2591,8 +2692,8 @@
         <w:t xml:space="preserve">Dados cadastrais da BR-230 (Rodovia Transamazônica), atestando a extensão implantada de cerca de 4.260 km entre Cabedelo (PB) e Lábrea (AM), e os limites de quilometragem por estado (ex.: 521,0 km na Paraíba e 144,7 km no Tocantins).</w:t>
       </w:r>
     </w:p>
-    <w:bookmarkEnd w:id="21"/>
-    <w:bookmarkStart w:id="22" w:name="X91f5693dd2b6d85050fb6db7c64d5649978df03"/>
+    <w:bookmarkEnd w:id="26"/>
+    <w:bookmarkStart w:id="27" w:name="X91f5693dd2b6d85050fb6db7c64d5649978df03"/>
     <w:p>
       <w:pPr>
         <w:pStyle w:val="Heading2"/>
@@ -2940,9 +3041,9 @@
         </w:pict>
       </w:r>
     </w:p>
-    <w:bookmarkEnd w:id="22"/>
-    <w:bookmarkEnd w:id="23"/>
-    <w:bookmarkStart w:id="49" w:name="X488324d29406a77a74a98ebd3aefb2085589bc4"/>
+    <w:bookmarkEnd w:id="27"/>
+    <w:bookmarkEnd w:id="28"/>
+    <w:bookmarkStart w:id="54" w:name="X488324d29406a77a74a98ebd3aefb2085589bc4"/>
     <w:p>
       <w:pPr>
         <w:pStyle w:val="Heading1"/>
@@ -3143,7 +3244,7 @@
         </w:pict>
       </w:r>
     </w:p>
-    <w:bookmarkStart w:id="28" w:name="Xf0e03e8ecfcd3c1a5239b65661cfea51ed893bc"/>
+    <w:bookmarkStart w:id="33" w:name="Xf0e03e8ecfcd3c1a5239b65661cfea51ed893bc"/>
     <w:p>
       <w:pPr>
         <w:pStyle w:val="Heading2"/>
@@ -3196,7 +3297,7 @@
         <w:t xml:space="preserve">), uma linha corresponde exatamente a um sinistro de trânsito registrado pela Polícia Rodoviária Federal.</w:t>
       </w:r>
     </w:p>
-    <w:bookmarkStart w:id="24" w:name="X0eb470abd0a018b0b69cf68f0783a6b413d2fb9"/>
+    <w:bookmarkStart w:id="29" w:name="X0eb470abd0a018b0b69cf68f0783a6b413d2fb9"/>
     <w:p>
       <w:pPr>
         <w:pStyle w:val="Heading3"/>
@@ -3390,8 +3491,8 @@
         <w:t xml:space="preserve">). A média mensal na BR-230 evolui gradualmente de 112 acidentes/mês em 2022 para 145 acidentes/mês em 2025.</w:t>
       </w:r>
     </w:p>
-    <w:bookmarkEnd w:id="24"/>
-    <w:bookmarkStart w:id="25" w:name="Xc0cd6625134e9a6f59eabe38b0c59535e3804db"/>
+    <w:bookmarkEnd w:id="29"/>
+    <w:bookmarkStart w:id="30" w:name="Xc0cd6625134e9a6f59eabe38b0c59535e3804db"/>
     <w:p>
       <w:pPr>
         <w:pStyle w:val="Heading3"/>
@@ -4855,8 +4956,8 @@
         </w:tc>
       </w:tr>
     </w:tbl>
-    <w:bookmarkEnd w:id="25"/>
-    <w:bookmarkStart w:id="26" w:name="X1baba9be13575962a94cf02af8327eef68745b7"/>
+    <w:bookmarkEnd w:id="30"/>
+    <w:bookmarkStart w:id="31" w:name="X1baba9be13575962a94cf02af8327eef68745b7"/>
     <w:p>
       <w:pPr>
         <w:pStyle w:val="Heading3"/>
@@ -6033,8 +6134,8 @@
         <w:t xml:space="preserve">Céu Claro: 4.391 (70,63%); Nublado: 650 (10,46%); Sol: 462 (7,43%); Chuva: 431 (6,93%); Garoa/Chuvisco: 160 (2,57%).</w:t>
       </w:r>
     </w:p>
-    <w:bookmarkEnd w:id="26"/>
-    <w:bookmarkStart w:id="27" w:name="avaliação-de-atendimento-aos-requisitos"/>
+    <w:bookmarkEnd w:id="31"/>
+    <w:bookmarkStart w:id="32" w:name="avaliação-de-atendimento-aos-requisitos"/>
     <w:p>
       <w:pPr>
         <w:pStyle w:val="Heading3"/>
@@ -6058,9 +6159,9 @@
         </w:pict>
       </w:r>
     </w:p>
-    <w:bookmarkEnd w:id="27"/>
-    <w:bookmarkEnd w:id="28"/>
-    <w:bookmarkStart w:id="33" w:name="Xae2e85b19746561d698bc4e937ee59c770d4799"/>
+    <w:bookmarkEnd w:id="32"/>
+    <w:bookmarkEnd w:id="33"/>
+    <w:bookmarkStart w:id="38" w:name="Xae2e85b19746561d698bc4e937ee59c770d4799"/>
     <w:p>
       <w:pPr>
         <w:pStyle w:val="Heading2"/>
@@ -6089,7 +6190,7 @@
         <w:t xml:space="preserve">A base de pessoas detalha individualmente cada pessoa presente no evento viário (condutores, passageiros e pedestres).</w:t>
       </w:r>
     </w:p>
-    <w:bookmarkStart w:id="29" w:name="embalagem-volumetria-e-grão-demográfico"/>
+    <w:bookmarkStart w:id="34" w:name="embalagem-volumetria-e-grão-demográfico"/>
     <w:p>
       <w:pPr>
         <w:pStyle w:val="Heading3"/>
@@ -6346,8 +6447,8 @@
         <w:t xml:space="preserve">as contagens homônimas da Fonte 1 (zero divergência).</w:t>
       </w:r>
     </w:p>
-    <w:bookmarkEnd w:id="29"/>
-    <w:bookmarkStart w:id="30" w:name="X850e44996b241aa573b2c0620040dd926039dbe"/>
+    <w:bookmarkEnd w:id="34"/>
+    <w:bookmarkStart w:id="35" w:name="X850e44996b241aa573b2c0620040dd926039dbe"/>
     <w:p>
       <w:pPr>
         <w:pStyle w:val="Heading3"/>
@@ -6859,8 +6960,8 @@
         </w:tc>
       </w:tr>
     </w:tbl>
-    <w:bookmarkEnd w:id="30"/>
-    <w:bookmarkStart w:id="31" w:name="X9985fe5f0164054f1d8956db847ff0321093b01"/>
+    <w:bookmarkEnd w:id="35"/>
+    <w:bookmarkStart w:id="36" w:name="X9985fe5f0164054f1d8956db847ff0321093b01"/>
     <w:p>
       <w:pPr>
         <w:pStyle w:val="Heading3"/>
@@ -7017,8 +7118,8 @@
         <w:t xml:space="preserve">Automóveis: 4.992 (31,67%); Motocicletas: 4.570 (28,99%); Caminhonetes: 1.521 (9,65%); Veículos de carga pesada: 2.083 (13,21%).</w:t>
       </w:r>
     </w:p>
-    <w:bookmarkEnd w:id="31"/>
-    <w:bookmarkStart w:id="32" w:name="X2bd5724ba4668921402b4f9b06b483f820e6e3a"/>
+    <w:bookmarkEnd w:id="36"/>
+    <w:bookmarkStart w:id="37" w:name="X2bd5724ba4668921402b4f9b06b483f820e6e3a"/>
     <w:p>
       <w:pPr>
         <w:pStyle w:val="Heading3"/>
@@ -7042,9 +7143,9 @@
         </w:pict>
       </w:r>
     </w:p>
-    <w:bookmarkEnd w:id="32"/>
-    <w:bookmarkEnd w:id="33"/>
-    <w:bookmarkStart w:id="38" w:name="X15cc6cdd75f6b59aa5e711c2fe93815aa81528f"/>
+    <w:bookmarkEnd w:id="37"/>
+    <w:bookmarkEnd w:id="38"/>
+    <w:bookmarkStart w:id="43" w:name="X15cc6cdd75f6b59aa5e711c2fe93815aa81528f"/>
     <w:p>
       <w:pPr>
         <w:pStyle w:val="Heading2"/>
@@ -7070,7 +7171,7 @@
         <w:t xml:space="preserve">Extração pericial especializada disponibilizada pela PRF para o ano de 2025.</w:t>
       </w:r>
     </w:p>
-    <w:bookmarkStart w:id="34" w:name="embalagem-volumetria-e-grão-pericial"/>
+    <w:bookmarkStart w:id="39" w:name="embalagem-volumetria-e-grão-pericial"/>
     <w:p>
       <w:pPr>
         <w:pStyle w:val="Heading3"/>
@@ -7229,8 +7330,8 @@
         <w:t xml:space="preserve">na BR-230 em 2025 (para 1.745 acidentes e 4.410 pessoas).</w:t>
       </w:r>
     </w:p>
-    <w:bookmarkEnd w:id="34"/>
-    <w:bookmarkStart w:id="35" w:name="X4f6a48b0373d6d2ba658aaae8a55bf6740a52b0"/>
+    <w:bookmarkEnd w:id="39"/>
+    <w:bookmarkStart w:id="40" w:name="X4f6a48b0373d6d2ba658aaae8a55bf6740a52b0"/>
     <w:p>
       <w:pPr>
         <w:pStyle w:val="Heading3"/>
@@ -7329,8 +7430,8 @@
         <w:t xml:space="preserve">): Inteiro sequencial (1, 2, 3…) que expressa a cronologia dos impactos da colisão.</w:t>
       </w:r>
     </w:p>
-    <w:bookmarkEnd w:id="35"/>
-    <w:bookmarkStart w:id="36" w:name="Xd6276a977c8ec0e171c015349393569d0c69b9d"/>
+    <w:bookmarkEnd w:id="40"/>
+    <w:bookmarkStart w:id="41" w:name="Xd6276a977c8ec0e171c015349393569d0c69b9d"/>
     <w:p>
       <w:pPr>
         <w:pStyle w:val="Heading3"/>
@@ -7530,8 +7631,8 @@
         <w:t xml:space="preserve">da Fonte 2 em 2025, provando 100,0% de coerência interna.</w:t>
       </w:r>
     </w:p>
-    <w:bookmarkEnd w:id="36"/>
-    <w:bookmarkStart w:id="37" w:name="X4ffbd943b626a1cf13a097ed28caf5cc06cd871"/>
+    <w:bookmarkEnd w:id="41"/>
+    <w:bookmarkStart w:id="42" w:name="X4ffbd943b626a1cf13a097ed28caf5cc06cd871"/>
     <w:p>
       <w:pPr>
         <w:pStyle w:val="Heading3"/>
@@ -7555,9 +7656,9 @@
         </w:pict>
       </w:r>
     </w:p>
-    <w:bookmarkEnd w:id="37"/>
-    <w:bookmarkEnd w:id="38"/>
-    <w:bookmarkStart w:id="42" w:name="X549664b1dea5cb54d6ceaf02c45925222bc3dfe"/>
+    <w:bookmarkEnd w:id="42"/>
+    <w:bookmarkEnd w:id="43"/>
+    <w:bookmarkStart w:id="47" w:name="X549664b1dea5cb54d6ceaf02c45925222bc3dfe"/>
     <w:p>
       <w:pPr>
         <w:pStyle w:val="Heading2"/>
@@ -7574,7 +7675,7 @@
         <w:t xml:space="preserve">Cadastro físico-espacial do Sistema Nacional de Viação (SNV / DNIT).</w:t>
       </w:r>
     </w:p>
-    <w:bookmarkStart w:id="39" w:name="formato-grão-e-volumetria-cadastral"/>
+    <w:bookmarkStart w:id="44" w:name="formato-grão-e-volumetria-cadastral"/>
     <w:p>
       <w:pPr>
         <w:pStyle w:val="Heading3"/>
@@ -7665,8 +7766,8 @@
         <w:t xml:space="preserve">em 7 UFs.</w:t>
       </w:r>
     </w:p>
-    <w:bookmarkEnd w:id="39"/>
-    <w:bookmarkStart w:id="40" w:name="Xedfbcf96f4a606a24fc09e0518e769268b09b06"/>
+    <w:bookmarkEnd w:id="44"/>
+    <w:bookmarkStart w:id="45" w:name="Xedfbcf96f4a606a24fc09e0518e769268b09b06"/>
     <w:p>
       <w:pPr>
         <w:pStyle w:val="Heading3"/>
@@ -8408,8 +8509,8 @@
         <w:t xml:space="preserve">Auditoria viária confirma ainda que os 150 km duplicados cadastrados no SNV (Cabedelo a Campina Grande) coincidem perfeitamente com os 2.865 registros de acidentes em pista dupla na Paraíba.</w:t>
       </w:r>
     </w:p>
-    <w:bookmarkEnd w:id="40"/>
-    <w:bookmarkStart w:id="41" w:name="X4df4cf5fbc5fe984cbffcee65fd14667a287dbd"/>
+    <w:bookmarkEnd w:id="45"/>
+    <w:bookmarkStart w:id="46" w:name="X4df4cf5fbc5fe984cbffcee65fd14667a287dbd"/>
     <w:p>
       <w:pPr>
         <w:pStyle w:val="Heading3"/>
@@ -8433,9 +8534,9 @@
         </w:pict>
       </w:r>
     </w:p>
-    <w:bookmarkEnd w:id="41"/>
-    <w:bookmarkEnd w:id="42"/>
-    <w:bookmarkStart w:id="46" w:name="Xf0074e30d735eed5b085a8c783ea8985a5acba2"/>
+    <w:bookmarkEnd w:id="46"/>
+    <w:bookmarkEnd w:id="47"/>
+    <w:bookmarkStart w:id="51" w:name="Xf0074e30d735eed5b085a8c783ea8985a5acba2"/>
     <w:p>
       <w:pPr>
         <w:pStyle w:val="Heading2"/>
@@ -8452,7 +8553,7 @@
         <w:t xml:space="preserve">Relatório institucional publicado pela Coordenação-Geral de Segurança Viária da PRF em Brasília/DF (maio de 2026).</w:t>
       </w:r>
     </w:p>
-    <w:bookmarkStart w:id="43" w:name="X3a983cb7910e88b99325a589e590bd43ce0db24"/>
+    <w:bookmarkStart w:id="48" w:name="X3a983cb7910e88b99325a589e590bd43ce0db24"/>
     <w:p>
       <w:pPr>
         <w:pStyle w:val="Heading3"/>
@@ -8527,8 +8628,8 @@
         <w:t xml:space="preserve">72.529 sinistros, 6.043 mortos, 20.898 feridos graves, 58.745 feridos leves, 76.541 ilesos e 194.629 pessoas no país em 2025; 1.745 acidentes e 192 óbitos na BR-230.</w:t>
       </w:r>
     </w:p>
-    <w:bookmarkEnd w:id="43"/>
-    <w:bookmarkStart w:id="44" w:name="X5971dc223dee284f0f5a9f2a47deca2d7f623c5"/>
+    <w:bookmarkEnd w:id="48"/>
+    <w:bookmarkStart w:id="49" w:name="X5971dc223dee284f0f5a9f2a47deca2d7f623c5"/>
     <w:p>
       <w:pPr>
         <w:pStyle w:val="Heading3"/>
@@ -9175,8 +9276,8 @@
         </w:tc>
       </w:tr>
     </w:tbl>
-    <w:bookmarkEnd w:id="44"/>
-    <w:bookmarkStart w:id="45" w:name="X12994f521ae59469d0ea6dad0f4e3845f044ce4"/>
+    <w:bookmarkEnd w:id="49"/>
+    <w:bookmarkStart w:id="50" w:name="X12994f521ae59469d0ea6dad0f4e3845f044ce4"/>
     <w:p>
       <w:pPr>
         <w:pStyle w:val="Heading3"/>
@@ -9200,9 +9301,9 @@
         </w:pict>
       </w:r>
     </w:p>
-    <w:bookmarkEnd w:id="45"/>
-    <w:bookmarkEnd w:id="46"/>
-    <w:bookmarkStart w:id="47" w:name="Xea6391ed4bd1f67258d39798c8fdb4b9a433df2"/>
+    <w:bookmarkEnd w:id="50"/>
+    <w:bookmarkEnd w:id="51"/>
+    <w:bookmarkStart w:id="52" w:name="Xea6391ed4bd1f67258d39798c8fdb4b9a433df2"/>
     <w:p>
       <w:pPr>
         <w:pStyle w:val="Heading2"/>
@@ -9834,8 +9935,8 @@
         </w:pict>
       </w:r>
     </w:p>
-    <w:bookmarkEnd w:id="47"/>
-    <w:bookmarkStart w:id="48" w:name="X543324b4e5803f54463c5e18bf0b062db2762c1"/>
+    <w:bookmarkEnd w:id="52"/>
+    <w:bookmarkStart w:id="53" w:name="X543324b4e5803f54463c5e18bf0b062db2762c1"/>
     <w:p>
       <w:pPr>
         <w:pStyle w:val="Heading2"/>
@@ -9969,9 +10070,9 @@
         </w:pict>
       </w:r>
     </w:p>
-    <w:bookmarkEnd w:id="48"/>
-    <w:bookmarkEnd w:id="49"/>
-    <w:bookmarkStart w:id="83" w:name="exploração-dos-dados"/>
+    <w:bookmarkEnd w:id="53"/>
+    <w:bookmarkEnd w:id="54"/>
+    <w:bookmarkStart w:id="88" w:name="exploração-dos-dados"/>
     <w:p>
       <w:pPr>
         <w:pStyle w:val="Heading1"/>
@@ -10005,7 +10106,7 @@
         </w:pict>
       </w:r>
     </w:p>
-    <w:bookmarkStart w:id="58" w:name="Xfa6e113a5e8137f95176886220297f19343e652"/>
+    <w:bookmarkStart w:id="63" w:name="Xfa6e113a5e8137f95176886220297f19343e652"/>
     <w:p>
       <w:pPr>
         <w:pStyle w:val="Heading2"/>
@@ -10072,18 +10173,18 @@
           <wp:inline>
             <wp:extent cx="5334000" cy="1285553"/>
             <wp:effectExtent b="0" l="0" r="0" t="0"/>
-            <wp:docPr descr="Mapa Espacial da BR-230 no Quadriênio 2022-2025" title="" id="51" name="Picture"/>
+            <wp:docPr descr="Mapa Espacial da BR-230 no Quadriênio 2022-2025" title="" id="56" name="Picture"/>
             <a:graphic>
               <a:graphicData uri="http://schemas.openxmlformats.org/drawingml/2006/picture">
                 <pic:pic>
                   <pic:nvPicPr>
-                    <pic:cNvPr descr="figuras/mapa_dispersao_br230.png" id="52" name="Picture"/>
+                    <pic:cNvPr descr="figuras/mapa_dispersao_br230.png" id="57" name="Picture"/>
                     <pic:cNvPicPr>
                       <a:picLocks noChangeArrowheads="1" noChangeAspect="1"/>
                     </pic:cNvPicPr>
                   </pic:nvPicPr>
                   <pic:blipFill>
-                    <a:blip r:embed="rId50"/>
+                    <a:blip r:embed="rId55"/>
                     <a:stretch>
                       <a:fillRect/>
                     </a:stretch>
@@ -10127,18 +10228,18 @@
           <wp:inline>
             <wp:extent cx="5334000" cy="1999635"/>
             <wp:effectExtent b="0" l="0" r="0" t="0"/>
-            <wp:docPr descr="Acidentes e Letalidade por UF na BR-230" title="" id="54" name="Picture"/>
+            <wp:docPr descr="Acidentes e Letalidade por UF na BR-230" title="" id="59" name="Picture"/>
             <a:graphic>
               <a:graphicData uri="http://schemas.openxmlformats.org/drawingml/2006/picture">
                 <pic:pic>
                   <pic:nvPicPr>
-                    <pic:cNvPr descr="figuras/acidentes_letalidade_uf.png" id="55" name="Picture"/>
+                    <pic:cNvPr descr="figuras/acidentes_letalidade_uf.png" id="60" name="Picture"/>
                     <pic:cNvPicPr>
                       <a:picLocks noChangeArrowheads="1" noChangeAspect="1"/>
                     </pic:cNvPicPr>
                   </pic:nvPicPr>
                   <pic:blipFill>
-                    <a:blip r:embed="rId53"/>
+                    <a:blip r:embed="rId58"/>
                     <a:stretch>
                       <a:fillRect/>
                     </a:stretch>
@@ -10173,7 +10274,7 @@
         <w:t xml:space="preserve">Acidentes e Letalidade por UF na BR-230</w:t>
       </w:r>
     </w:p>
-    <w:bookmarkStart w:id="56" w:name="X175ce88dc3d86e14f4e42964f0beaf58ebce88e"/>
+    <w:bookmarkStart w:id="61" w:name="X175ce88dc3d86e14f4e42964f0beaf58ebce88e"/>
     <w:p>
       <w:pPr>
         <w:pStyle w:val="Heading3"/>
@@ -11476,8 +11577,8 @@
         </w:tc>
       </w:tr>
     </w:tbl>
-    <w:bookmarkEnd w:id="56"/>
-    <w:bookmarkStart w:id="57" w:name="Xab6e763a4df7401d4590f2a580714c180b043f6"/>
+    <w:bookmarkEnd w:id="61"/>
+    <w:bookmarkStart w:id="62" w:name="Xab6e763a4df7401d4590f2a580714c180b043f6"/>
     <w:p>
       <w:pPr>
         <w:pStyle w:val="Heading3"/>
@@ -11665,9 +11766,9 @@
         </w:pict>
       </w:r>
     </w:p>
-    <w:bookmarkEnd w:id="57"/>
-    <w:bookmarkEnd w:id="58"/>
-    <w:bookmarkStart w:id="68" w:name="X225ffd8a591b6a4e857fb3f01a9c2ee1cc47538"/>
+    <w:bookmarkEnd w:id="62"/>
+    <w:bookmarkEnd w:id="63"/>
+    <w:bookmarkStart w:id="73" w:name="X225ffd8a591b6a4e857fb3f01a9c2ee1cc47538"/>
     <w:p>
       <w:pPr>
         <w:pStyle w:val="Heading2"/>
@@ -11685,18 +11786,18 @@
           <wp:inline>
             <wp:extent cx="5334000" cy="3315567"/>
             <wp:effectExtent b="0" l="0" r="0" t="0"/>
-            <wp:docPr descr="Distribuição Temporal Consolidada da BR-230 (2022-2025)" title="" id="60" name="Picture"/>
+            <wp:docPr descr="Distribuição Temporal Consolidada da BR-230 (2022-2025)" title="" id="65" name="Picture"/>
             <a:graphic>
               <a:graphicData uri="http://schemas.openxmlformats.org/drawingml/2006/picture">
                 <pic:pic>
                   <pic:nvPicPr>
-                    <pic:cNvPr descr="figuras/distribuicao_temporal.png" id="61" name="Picture"/>
+                    <pic:cNvPr descr="figuras/distribuicao_temporal.png" id="66" name="Picture"/>
                     <pic:cNvPicPr>
                       <a:picLocks noChangeArrowheads="1" noChangeAspect="1"/>
                     </pic:cNvPicPr>
                   </pic:nvPicPr>
                   <pic:blipFill>
-                    <a:blip r:embed="rId59"/>
+                    <a:blip r:embed="rId64"/>
                     <a:stretch>
                       <a:fillRect/>
                     </a:stretch>
@@ -11740,18 +11841,18 @@
           <wp:inline>
             <wp:extent cx="5334000" cy="1999022"/>
             <wp:effectExtent b="0" l="0" r="0" t="0"/>
-            <wp:docPr descr="Proporção Fatal por Fase do Dia e Horário" title="" id="63" name="Picture"/>
+            <wp:docPr descr="Proporção Fatal por Fase do Dia e Horário" title="" id="68" name="Picture"/>
             <a:graphic>
               <a:graphicData uri="http://schemas.openxmlformats.org/drawingml/2006/picture">
                 <pic:pic>
                   <pic:nvPicPr>
-                    <pic:cNvPr descr="figuras/fase_dia_letalidade.png" id="64" name="Picture"/>
+                    <pic:cNvPr descr="figuras/fase_dia_letalidade.png" id="69" name="Picture"/>
                     <pic:cNvPicPr>
                       <a:picLocks noChangeArrowheads="1" noChangeAspect="1"/>
                     </pic:cNvPicPr>
                   </pic:nvPicPr>
                   <pic:blipFill>
-                    <a:blip r:embed="rId62"/>
+                    <a:blip r:embed="rId67"/>
                     <a:stretch>
                       <a:fillRect/>
                     </a:stretch>
@@ -11798,7 +11899,7 @@
         <w:t xml:space="preserve">Quando os acidentes acontecem? Os períodos com maior volume de colisões coincidem com os momentos de maior gravidade?</w:t>
       </w:r>
     </w:p>
-    <w:bookmarkStart w:id="65" w:name="sazonalidade-mensal"/>
+    <w:bookmarkStart w:id="70" w:name="sazonalidade-mensal"/>
     <w:p>
       <w:pPr>
         <w:pStyle w:val="Heading3"/>
@@ -11815,8 +11916,8 @@
         <w:t xml:space="preserve">O volume mensal de acidentes na BR-230 ao longo de 2025 apresenta grande estabilidade: janeiro (131), fevereiro (127), março (144), abril (139), maio (147), junho (147), julho (150), agosto (150), setembro (145), outubro (150), novembro (149) e dezembro (166). Não se observa um mês isolado com pico desproporcional, demonstrando que a rodovia opera sob demanda contínua de tráfego.</w:t>
       </w:r>
     </w:p>
-    <w:bookmarkEnd w:id="65"/>
-    <w:bookmarkStart w:id="66" w:name="dia-da-semana-e-letalidade"/>
+    <w:bookmarkEnd w:id="70"/>
+    <w:bookmarkStart w:id="71" w:name="dia-da-semana-e-letalidade"/>
     <w:p>
       <w:pPr>
         <w:pStyle w:val="Heading3"/>
@@ -12403,8 +12504,8 @@
         <w:t xml:space="preserve">), indicando forte influência do lazer, excesso de velocidade e consumo de bebidas alcoólicas.</w:t>
       </w:r>
     </w:p>
-    <w:bookmarkEnd w:id="66"/>
-    <w:bookmarkStart w:id="67" w:name="ciclo-horário-e-fase-do-dia"/>
+    <w:bookmarkEnd w:id="71"/>
+    <w:bookmarkStart w:id="72" w:name="ciclo-horário-e-fase-do-dia"/>
     <w:p>
       <w:pPr>
         <w:pStyle w:val="Heading3"/>
@@ -12825,9 +12926,9 @@
         </w:pict>
       </w:r>
     </w:p>
-    <w:bookmarkEnd w:id="67"/>
-    <w:bookmarkEnd w:id="68"/>
-    <w:bookmarkStart w:id="72" w:name="X81d53ac65b3f4da19f3b1629c62376d2695a865"/>
+    <w:bookmarkEnd w:id="72"/>
+    <w:bookmarkEnd w:id="73"/>
+    <w:bookmarkStart w:id="77" w:name="X81d53ac65b3f4da19f3b1629c62376d2695a865"/>
     <w:p>
       <w:pPr>
         <w:pStyle w:val="Heading2"/>
@@ -12848,7 +12949,7 @@
         <w:t xml:space="preserve">Quais condições de infraestrutura e do ambiente meteorológico estão associadas à ocorrência de sinistros e ao aumento da gravidade?</w:t>
       </w:r>
     </w:p>
-    <w:bookmarkStart w:id="69" w:name="condição-meteorológica"/>
+    <w:bookmarkStart w:id="74" w:name="condição-meteorológica"/>
     <w:p>
       <w:pPr>
         <w:pStyle w:val="Heading3"/>
@@ -12933,8 +13034,8 @@
         <w:t xml:space="preserve">). Isso ocorre porque sob pista molhada e precipitação os motoristas reduzem a velocidade média, diminuindo a probabilidade de impacto fatal.</w:t>
       </w:r>
     </w:p>
-    <w:bookmarkEnd w:id="69"/>
-    <w:bookmarkStart w:id="70" w:name="tipo-de-pista-e-uso-do-solo"/>
+    <w:bookmarkEnd w:id="74"/>
+    <w:bookmarkStart w:id="75" w:name="tipo-de-pista-e-uso-do-solo"/>
     <w:p>
       <w:pPr>
         <w:pStyle w:val="Heading3"/>
@@ -13327,8 +13428,8 @@
         <w:t xml:space="preserve">e 131 mortes).</w:t>
       </w:r>
     </w:p>
-    <w:bookmarkEnd w:id="70"/>
-    <w:bookmarkStart w:id="71" w:name="geometria-da-via"/>
+    <w:bookmarkEnd w:id="75"/>
+    <w:bookmarkStart w:id="76" w:name="geometria-da-via"/>
     <w:p>
       <w:pPr>
         <w:pStyle w:val="Heading3"/>
@@ -13424,9 +13525,9 @@
         </w:pict>
       </w:r>
     </w:p>
-    <w:bookmarkEnd w:id="71"/>
-    <w:bookmarkEnd w:id="72"/>
-    <w:bookmarkStart w:id="75" w:name="X02f27f774a765739f9c5b266f5a2bc6a5f223c6"/>
+    <w:bookmarkEnd w:id="76"/>
+    <w:bookmarkEnd w:id="77"/>
+    <w:bookmarkStart w:id="80" w:name="X02f27f774a765739f9c5b266f5a2bc6a5f223c6"/>
     <w:p>
       <w:pPr>
         <w:pStyle w:val="Heading2"/>
@@ -13480,7 +13581,7 @@
         <w:t xml:space="preserve">- Onde os acidentes são menos volumosos (Norte/Nordeste interiorano, pista simples, área rural), a taxa de fatalidade atinge níveis alarmantes.</w:t>
       </w:r>
     </w:p>
-    <w:bookmarkStart w:id="73" w:name="X1010a78216488a5c621f84138aeca52ddb3e347"/>
+    <w:bookmarkStart w:id="78" w:name="X1010a78216488a5c621f84138aeca52ddb3e347"/>
     <w:p>
       <w:pPr>
         <w:pStyle w:val="Heading3"/>
@@ -14370,8 +14471,8 @@
         <w:t xml:space="preserve">(1 em cada 4 acidentes resulta em óbito). No Ceará, esse valor atinge 52,63% e no Tocantins 38,10%.</w:t>
       </w:r>
     </w:p>
-    <w:bookmarkEnd w:id="73"/>
-    <w:bookmarkStart w:id="74" w:name="Xeffa76b1eb8f207346fd216747182b36c8622d5"/>
+    <w:bookmarkEnd w:id="78"/>
+    <w:bookmarkStart w:id="79" w:name="Xeffa76b1eb8f207346fd216747182b36c8622d5"/>
     <w:p>
       <w:pPr>
         <w:pStyle w:val="Heading3"/>
@@ -14526,9 +14627,9 @@
         </w:pict>
       </w:r>
     </w:p>
-    <w:bookmarkEnd w:id="74"/>
-    <w:bookmarkEnd w:id="75"/>
-    <w:bookmarkStart w:id="82" w:name="X79edf7c61eb5d1252bafb55ba078ee45b2b2ead"/>
+    <w:bookmarkEnd w:id="79"/>
+    <w:bookmarkEnd w:id="80"/>
+    <w:bookmarkStart w:id="87" w:name="X79edf7c61eb5d1252bafb55ba078ee45b2b2ead"/>
     <w:p>
       <w:pPr>
         <w:pStyle w:val="Heading2"/>
@@ -14549,7 +14650,7 @@
         <w:t xml:space="preserve">Quais fatores causais e modalidades de colisão predominam? Quem são as vítimas mais afetadas e quais veículos participam dos sinistros?</w:t>
       </w:r>
     </w:p>
-    <w:bookmarkStart w:id="76" w:name="causas-determinantes"/>
+    <w:bookmarkStart w:id="81" w:name="causas-determinantes"/>
     <w:p>
       <w:pPr>
         <w:pStyle w:val="Heading3"/>
@@ -14682,8 +14783,8 @@
         <w:t xml:space="preserve">6. Manobra de mudança de faixa indevida (91), Transitar na contramão (77), Falhas mecânicas/elétricas (64), Animais na pista (59), Velocidade incompatível (48) e Condutor dormindo (33).</w:t>
       </w:r>
     </w:p>
-    <w:bookmarkEnd w:id="76"/>
-    <w:bookmarkStart w:id="80" w:name="tipos-de-acidentes"/>
+    <w:bookmarkEnd w:id="81"/>
+    <w:bookmarkStart w:id="85" w:name="tipos-de-acidentes"/>
     <w:p>
       <w:pPr>
         <w:pStyle w:val="Heading3"/>
@@ -14811,18 +14912,18 @@
           <wp:inline>
             <wp:extent cx="5334000" cy="2475282"/>
             <wp:effectExtent b="0" l="0" r="0" t="0"/>
-            <wp:docPr descr="Distribuição Etária das Pessoas Envolvidas na BR-230 (2022-2025)" title="" id="78" name="Picture"/>
+            <wp:docPr descr="Distribuição Etária das Pessoas Envolvidas na BR-230 (2022-2025)" title="" id="83" name="Picture"/>
             <a:graphic>
               <a:graphicData uri="http://schemas.openxmlformats.org/drawingml/2006/picture">
                 <pic:pic>
                   <pic:nvPicPr>
-                    <pic:cNvPr descr="figuras/distribuicao_idade.png" id="79" name="Picture"/>
+                    <pic:cNvPr descr="figuras/distribuicao_idade.png" id="84" name="Picture"/>
                     <pic:cNvPicPr>
                       <a:picLocks noChangeArrowheads="1" noChangeAspect="1"/>
                     </pic:cNvPicPr>
                   </pic:nvPicPr>
                   <pic:blipFill>
-                    <a:blip r:embed="rId77"/>
+                    <a:blip r:embed="rId82"/>
                     <a:stretch>
                       <a:fillRect/>
                     </a:stretch>
@@ -14857,8 +14958,8 @@
         <w:t xml:space="preserve">Distribuição Etária das Pessoas Envolvidas na BR-230 (2022-2025)</w:t>
       </w:r>
     </w:p>
-    <w:bookmarkEnd w:id="80"/>
-    <w:bookmarkStart w:id="81" w:name="X3241f97f8ab89a7a7c06c18e6d8eba88cd9091e"/>
+    <w:bookmarkEnd w:id="85"/>
+    <w:bookmarkStart w:id="86" w:name="X3241f97f8ab89a7a7c06c18e6d8eba88cd9091e"/>
     <w:p>
       <w:pPr>
         <w:pStyle w:val="Heading3"/>
@@ -15053,10 +15154,10 @@
         </w:pict>
       </w:r>
     </w:p>
-    <w:bookmarkEnd w:id="81"/>
-    <w:bookmarkEnd w:id="82"/>
-    <w:bookmarkEnd w:id="83"/>
-    <w:bookmarkStart w:id="91" w:name="qualidade-dos-dados"/>
+    <w:bookmarkEnd w:id="86"/>
+    <w:bookmarkEnd w:id="87"/>
+    <w:bookmarkEnd w:id="88"/>
+    <w:bookmarkStart w:id="96" w:name="qualidade-dos-dados"/>
     <w:p>
       <w:pPr>
         <w:pStyle w:val="Heading1"/>
@@ -15100,7 +15201,7 @@
         </w:pict>
       </w:r>
     </w:p>
-    <w:bookmarkStart w:id="84" w:name="completude-dos-dados"/>
+    <w:bookmarkStart w:id="89" w:name="completude-dos-dados"/>
     <w:p>
       <w:pPr>
         <w:pStyle w:val="Heading2"/>
@@ -15259,8 +15360,8 @@
         <w:t xml:space="preserve">que estima a densidade espacial das ocorrências.</w:t>
       </w:r>
     </w:p>
-    <w:bookmarkEnd w:id="84"/>
-    <w:bookmarkStart w:id="85" w:name="X370bc58805dc4234c7cb121c86ad26e0ead26cd"/>
+    <w:bookmarkEnd w:id="89"/>
+    <w:bookmarkStart w:id="90" w:name="X370bc58805dc4234c7cb121c86ad26e0ead26cd"/>
     <w:p>
       <w:pPr>
         <w:pStyle w:val="Heading2"/>
@@ -15599,8 +15700,8 @@
         <w:t xml:space="preserve">).</w:t>
       </w:r>
     </w:p>
-    <w:bookmarkEnd w:id="85"/>
-    <w:bookmarkStart w:id="86" w:name="valores-ausentes"/>
+    <w:bookmarkEnd w:id="90"/>
+    <w:bookmarkStart w:id="91" w:name="valores-ausentes"/>
     <w:p>
       <w:pPr>
         <w:pStyle w:val="Heading2"/>
@@ -16246,8 +16347,8 @@
         </w:tc>
       </w:tr>
     </w:tbl>
-    <w:bookmarkEnd w:id="86"/>
-    <w:bookmarkStart w:id="89" w:name="validação-externa-dos-dados"/>
+    <w:bookmarkEnd w:id="91"/>
+    <w:bookmarkStart w:id="94" w:name="validação-externa-dos-dados"/>
     <w:p>
       <w:pPr>
         <w:pStyle w:val="Heading2"/>
@@ -16264,7 +16365,7 @@
         <w:t xml:space="preserve">Para garantir a higidez e a consistência científica dos dados manipulados, realizou-se a validação cruzada externa confrontando os totais calculados no ambiente analítico contra fontes oficiais externas.</w:t>
       </w:r>
     </w:p>
-    <w:bookmarkStart w:id="87" w:name="X80b19431d03b6ca351424154e6ea0f4132ef9f0"/>
+    <w:bookmarkStart w:id="92" w:name="X80b19431d03b6ca351424154e6ea0f4132ef9f0"/>
     <w:p>
       <w:pPr>
         <w:pStyle w:val="Heading3"/>
@@ -16885,8 +16986,8 @@
         <w:t xml:space="preserve">utilizado no projeto é a extração consolidada e definitiva do fechamento de 2025 da PRF.</w:t>
       </w:r>
     </w:p>
-    <w:bookmarkEnd w:id="87"/>
-    <w:bookmarkStart w:id="88" w:name="X0a996f0d517e3fff1970e8b07a5962dccbb4b3d"/>
+    <w:bookmarkEnd w:id="92"/>
+    <w:bookmarkStart w:id="93" w:name="X0a996f0d517e3fff1970e8b07a5962dccbb4b3d"/>
     <w:p>
       <w:pPr>
         <w:pStyle w:val="Heading3"/>
@@ -17001,9 +17102,9 @@
         </w:pict>
       </w:r>
     </w:p>
-    <w:bookmarkEnd w:id="88"/>
-    <w:bookmarkEnd w:id="89"/>
-    <w:bookmarkStart w:id="90" w:name="X8df62a9233f96df4da54b90720ecb167615ceef"/>
+    <w:bookmarkEnd w:id="93"/>
+    <w:bookmarkEnd w:id="94"/>
+    <w:bookmarkStart w:id="95" w:name="X8df62a9233f96df4da54b90720ecb167615ceef"/>
     <w:p>
       <w:pPr>
         <w:pStyle w:val="Heading2"/>
@@ -17782,9 +17883,9 @@
         </w:pict>
       </w:r>
     </w:p>
-    <w:bookmarkEnd w:id="90"/>
-    <w:bookmarkEnd w:id="91"/>
-    <w:bookmarkStart w:id="93" w:name="referências"/>
+    <w:bookmarkEnd w:id="95"/>
+    <w:bookmarkEnd w:id="96"/>
+    <w:bookmarkStart w:id="98" w:name="referências"/>
     <w:p>
       <w:pPr>
         <w:pStyle w:val="Heading1"/>
@@ -17865,7 +17966,7 @@
       <w:r>
         <w:t xml:space="preserve"> </w:t>
       </w:r>
-      <w:hyperlink r:id="rId14">
+      <w:hyperlink r:id="rId19">
         <w:r>
           <w:rPr>
             <w:rStyle w:val="Hyperlink"/>
@@ -17914,7 +18015,7 @@
       <w:r>
         <w:t xml:space="preserve"> </w:t>
       </w:r>
-      <w:hyperlink r:id="rId92">
+      <w:hyperlink r:id="rId97">
         <w:r>
           <w:rPr>
             <w:rStyle w:val="Hyperlink"/>
@@ -17963,7 +18064,7 @@
       <w:r>
         <w:t xml:space="preserve"> </w:t>
       </w:r>
-      <w:hyperlink r:id="rId15">
+      <w:hyperlink r:id="rId20">
         <w:r>
           <w:rPr>
             <w:rStyle w:val="Hyperlink"/>
@@ -18012,7 +18113,7 @@
       <w:r>
         <w:t xml:space="preserve"> </w:t>
       </w:r>
-      <w:hyperlink r:id="rId16">
+      <w:hyperlink r:id="rId21">
         <w:r>
           <w:rPr>
             <w:rStyle w:val="Hyperlink"/>
@@ -18129,7 +18230,7 @@
         <w:t xml:space="preserve">. Accident Analysis &amp; Prevention.</w:t>
       </w:r>
     </w:p>
-    <w:bookmarkEnd w:id="93"/>
+    <w:bookmarkEnd w:id="98"/>
     <w:sectPr>
       <w:footnotePr>
         <w:numRestart w:val="eachSect"/>

</xml_diff>